<commit_message>
docs: add final project report document
</commit_message>
<xml_diff>
--- a/Rapport/Rapport.docx
+++ b/Rapport/Rapport.docx
@@ -2,6 +2,32 @@
 <file path=word/document.xml><?xml version="1.0" encoding="utf-8"?>
 <w:document xmlns:w="http://schemas.openxmlformats.org/wordprocessingml/2006/main" xmlns:m="http://schemas.openxmlformats.org/officeDocument/2006/math" xmlns:r="http://schemas.openxmlformats.org/officeDocument/2006/relationships" xmlns:o="urn:schemas-microsoft-com:office:office" xmlns:v="urn:schemas-microsoft-com:vml" xmlns:w10="urn:schemas-microsoft-com:office:word" xmlns:a="http://schemas.openxmlformats.org/drawingml/2006/main" xmlns:pic="http://schemas.openxmlformats.org/drawingml/2006/picture" xmlns:wp="http://schemas.openxmlformats.org/drawingml/2006/wordprocessingDrawing">
   <w:body>
+    <w:sdt>
+      <w:sdtPr>
+        <w:docPartObj>
+          <w:docPartGallery w:val="Table of Contents"/>
+          <w:docPartUnique/>
+        </w:docPartObj>
+      </w:sdtPr>
+      <w:sdtContent>
+        <w:p>
+          <w:pPr>
+            <w:pStyle w:val="TOCHeading"/>
+          </w:pPr>
+          <w:r>
+            <w:t xml:space="preserve">Table of Contents</w:t>
+          </w:r>
+        </w:p>
+        <w:p>
+          <w:r>
+            <w:fldChar w:fldCharType="begin" w:dirty="true"/>
+            <w:instrText xml:space="preserve">TOC \o "1-3" \h \z \u</w:instrText>
+            <w:fldChar w:fldCharType="separate"/>
+            <w:fldChar w:fldCharType="end"/>
+          </w:r>
+        </w:p>
+      </w:sdtContent>
+    </w:sdt>
     <w:bookmarkStart w:id="57" w:name="rapport-de-projet-de-fin-dannée"/>
     <w:p>
       <w:pPr>
@@ -1821,7 +1847,7 @@
       <w:r>
         <w:drawing>
           <wp:inline>
-            <wp:extent cx="5334000" cy="932208"/>
+            <wp:extent cx="5334000" cy="10605614"/>
             <wp:effectExtent b="0" l="0" r="0" t="0"/>
             <wp:docPr descr="Cas d’Utilisation Global" title="" id="26" name="Picture"/>
             <a:graphic>
@@ -1842,7 +1868,7 @@
                   <pic:spPr bwMode="auto">
                     <a:xfrm>
                       <a:off x="0" y="0"/>
-                      <a:ext cx="5334000" cy="932208"/>
+                      <a:ext cx="5334000" cy="10605614"/>
                     </a:xfrm>
                     <a:prstGeom prst="rect">
                       <a:avLst/>
@@ -2273,7 +2299,7 @@
       <w:r>
         <w:drawing>
           <wp:inline>
-            <wp:extent cx="5334000" cy="1306206"/>
+            <wp:extent cx="5334000" cy="5704505"/>
             <wp:effectExtent b="0" l="0" r="0" t="0"/>
             <wp:docPr descr="Cas d’Utilisation du Sprint 1" title="" id="32" name="Picture"/>
             <a:graphic>
@@ -2294,7 +2320,7 @@
                   <pic:spPr bwMode="auto">
                     <a:xfrm>
                       <a:off x="0" y="0"/>
-                      <a:ext cx="5334000" cy="1306206"/>
+                      <a:ext cx="5334000" cy="5704505"/>
                     </a:xfrm>
                     <a:prstGeom prst="rect">
                       <a:avLst/>
@@ -2592,14 +2618,14 @@
       <w:r>
         <w:drawing>
           <wp:inline>
-            <wp:extent cx="5334000" cy="1503663"/>
+            <wp:extent cx="5334000" cy="5649163"/>
             <wp:effectExtent b="0" l="0" r="0" t="0"/>
             <wp:docPr descr="Cas d’Utilisation du Sprint 2" title="" id="36" name="Picture"/>
             <a:graphic>
               <a:graphicData uri="http://schemas.openxmlformats.org/drawingml/2006/picture">
                 <pic:pic>
                   <pic:nvPicPr>
-                    <pic:cNvPr descr="images/sprinte-2.png" id="37" name="Picture"/>
+                    <pic:cNvPr descr="images/sprint-2.png" id="37" name="Picture"/>
                     <pic:cNvPicPr>
                       <a:picLocks noChangeArrowheads="1" noChangeAspect="1"/>
                     </pic:cNvPicPr>
@@ -2613,7 +2639,7 @@
                   <pic:spPr bwMode="auto">
                     <a:xfrm>
                       <a:off x="0" y="0"/>
-                      <a:ext cx="5334000" cy="1503663"/>
+                      <a:ext cx="5334000" cy="5649163"/>
                     </a:xfrm>
                     <a:prstGeom prst="rect">
                       <a:avLst/>
@@ -2977,7 +3003,7 @@
       <w:r>
         <w:drawing>
           <wp:inline>
-            <wp:extent cx="5334000" cy="7127035"/>
+            <wp:extent cx="5334000" cy="5736204"/>
             <wp:effectExtent b="0" l="0" r="0" t="0"/>
             <wp:docPr descr="Diagramme de Classe" title="" id="52" name="Picture"/>
             <a:graphic>
@@ -2998,7 +3024,7 @@
                   <pic:spPr bwMode="auto">
                     <a:xfrm>
                       <a:off x="0" y="0"/>
-                      <a:ext cx="5334000" cy="7127035"/>
+                      <a:ext cx="5334000" cy="5736204"/>
                     </a:xfrm>
                     <a:prstGeom prst="rect">
                       <a:avLst/>

</xml_diff>